<commit_message>
Harden stack security defaults
</commit_message>
<xml_diff>
--- a/stack.containers/test-runner/playwright-tests/fixtures/seafile-onlyoffice-demo.docx
+++ b/stack.containers/test-runner/playwright-tests/fixtures/seafile-onlyoffice-demo.docx
@@ -5,75 +5,162 @@
     <w:p>
       <w:pPr>
         <w:pStyle w:val="Heading1"/>
-        <w:bidi w:val="0"/>
-        <w:spacing w:before="0" w:after="480"/>
-        <w:ind w:hanging="0" w:start="0" w:end="0"/>
-        <w:jc w:val="start"/>
-        <w:rPr>
-          <w:color w:val="B91C1C"/>
-          <w:sz w:val="72"/>
-        </w:rPr>
-      </w:pPr>
-      <w:r>
-        <w:rPr>
-          <w:color w:val="B91C1C"/>
-          <w:sz w:val="72"/>
-        </w:rPr>
-        <w:t>STACK ONLYOFFICE OK</w:t>
+        <w:spacing w:before="0" w:after="320"/>
+        <w:rPr>
+          <w:color w:val="0F766E"/>
+          <w:sz w:val="52"/>
+        </w:rPr>
+      </w:pPr>
+      <w:r>
+        <w:rPr>
+          <w:color w:val="0F766E"/>
+          <w:sz w:val="52"/>
+        </w:rPr>
+        <w:t>Northwind Field Operations Handoff</w:t>
       </w:r>
     </w:p>
     <w:p>
       <w:pPr>
         <w:pStyle w:val="BodyText"/>
-        <w:bidi w:val="0"/>
-        <w:spacing w:before="0" w:after="360"/>
-        <w:ind w:hanging="0" w:start="0" w:end="0"/>
-        <w:jc w:val="start"/>
-        <w:rPr>
-          <w:sz w:val="36"/>
-        </w:rPr>
-      </w:pPr>
-      <w:r>
-        <w:rPr>
-          <w:sz w:val="36"/>
-        </w:rPr>
-        <w:t>Seafile opened this Word document inside OnlyOffice.</w:t>
+        <w:spacing w:before="0" w:after="240"/>
+        <w:rPr>
+          <w:sz w:val="26"/>
+        </w:rPr>
+      </w:pPr>
+      <w:r>
+        <w:rPr>
+          <w:sz w:val="26"/>
+        </w:rPr>
+        <w:t>Prepared for the synthetic Platform Operations review. This document is stored in Seafile and rendered through OnlyOffice to verify collaborative document editing in the stack.</w:t>
+      </w:r>
+    </w:p>
+    <w:p>
+      <w:pPr>
+        <w:pStyle w:val="Heading2"/>
+        <w:spacing w:before="240" w:after="160"/>
+        <w:rPr>
+          <w:color w:val="111827"/>
+          <w:sz w:val="32"/>
+        </w:rPr>
+      </w:pPr>
+      <w:r>
+        <w:rPr>
+          <w:color w:val="111827"/>
+          <w:sz w:val="32"/>
+        </w:rPr>
+        <w:t>Deployment window</w:t>
       </w:r>
     </w:p>
     <w:p>
       <w:pPr>
         <w:pStyle w:val="BodyText"/>
-        <w:bidi w:val="0"/>
-        <w:spacing w:before="0" w:after="360"/>
-        <w:ind w:hanging="0" w:start="0" w:end="0"/>
-        <w:jc w:val="start"/>
-        <w:rPr>
-          <w:sz w:val="32"/>
-        </w:rPr>
-      </w:pPr>
-      <w:r>
-        <w:rPr>
-          <w:sz w:val="32"/>
-        </w:rPr>
-        <w:t>This fixture exists purely for Playwright screenshot validation.</w:t>
+        <w:spacing w:before="0" w:after="120"/>
+        <w:rPr>
+          <w:sz w:val="24"/>
+        </w:rPr>
+      </w:pPr>
+      <w:r>
+        <w:rPr>
+          <w:sz w:val="24"/>
+        </w:rPr>
+        <w:t>Thursday 09:30-10:15: publish updated runbooks, confirm backup restore evidence, and hand off the customer portal smoke-check list.</w:t>
+      </w:r>
+    </w:p>
+    <w:p>
+      <w:pPr>
+        <w:pStyle w:val="Heading2"/>
+        <w:spacing w:before="240" w:after="160"/>
+        <w:rPr>
+          <w:color w:val="111827"/>
+          <w:sz w:val="32"/>
+        </w:rPr>
+      </w:pPr>
+      <w:r>
+        <w:rPr>
+          <w:color w:val="111827"/>
+          <w:sz w:val="32"/>
+        </w:rPr>
+        <w:t>Checklist</w:t>
+      </w:r>
+    </w:p>
+    <w:p>
+      <w:pPr>
+        <w:pStyle w:val="ListParagraph"/>
+        <w:spacing w:before="0" w:after="80"/>
+        <w:ind w:left="720" w:hanging="360"/>
+        <w:rPr>
+          <w:sz w:val="24"/>
+        </w:rPr>
+      </w:pPr>
+      <w:r>
+        <w:rPr>
+          <w:sz w:val="24"/>
+        </w:rPr>
+        <w:t>1. Confirm SSO login works for documents, files, chat, dashboards, and notebooks.</w:t>
+      </w:r>
+    </w:p>
+    <w:p>
+      <w:pPr>
+        <w:pStyle w:val="ListParagraph"/>
+        <w:spacing w:before="0" w:after="80"/>
+        <w:ind w:left="720" w:hanging="360"/>
+        <w:rPr>
+          <w:sz w:val="24"/>
+        </w:rPr>
+      </w:pPr>
+      <w:r>
+        <w:rPr>
+          <w:sz w:val="24"/>
+        </w:rPr>
+        <w:t>2. Attach the latest visual evidence bundle to the release record.</w:t>
+      </w:r>
+    </w:p>
+    <w:p>
+      <w:pPr>
+        <w:pStyle w:val="ListParagraph"/>
+        <w:spacing w:before="0" w:after="80"/>
+        <w:ind w:left="720" w:hanging="360"/>
+        <w:rPr>
+          <w:sz w:val="24"/>
+        </w:rPr>
+      </w:pPr>
+      <w:r>
+        <w:rPr>
+          <w:sz w:val="24"/>
+        </w:rPr>
+        <w:t>3. Record owners for follow-up actions before closing the deployment window.</w:t>
+      </w:r>
+    </w:p>
+    <w:p>
+      <w:pPr>
+        <w:pStyle w:val="Heading2"/>
+        <w:spacing w:before="240" w:after="160"/>
+        <w:rPr>
+          <w:color w:val="111827"/>
+          <w:sz w:val="32"/>
+        </w:rPr>
+      </w:pPr>
+      <w:r>
+        <w:rPr>
+          <w:color w:val="111827"/>
+          <w:sz w:val="32"/>
+        </w:rPr>
+        <w:t>Open actions</w:t>
       </w:r>
     </w:p>
     <w:p>
       <w:pPr>
         <w:pStyle w:val="BodyText"/>
-        <w:bidi w:val="0"/>
-        <w:spacing w:before="0" w:after="283"/>
-        <w:ind w:hanging="0" w:start="0" w:end="0"/>
-        <w:jc w:val="start"/>
-        <w:rPr>
-          <w:sz w:val="32"/>
-        </w:rPr>
-      </w:pPr>
-      <w:r>
-        <w:rPr>
-          <w:sz w:val="32"/>
-        </w:rPr>
-        <w:t>Bazel deploy path, Seafile upload path, and OnlyOffice rendering are all part of this smoke test.</w:t>
+        <w:spacing w:before="0" w:after="120"/>
+        <w:rPr>
+          <w:sz w:val="24"/>
+        </w:rPr>
+      </w:pPr>
+      <w:r>
+        <w:rPr>
+          <w:sz w:val="24"/>
+        </w:rPr>
+        <w:t>Owner: Platform Ops. Status: ready for review. Evidence: Seafile document library, OnlyOffice editor, and generated screenshot bundle.</w:t>
       </w:r>
     </w:p>
     <w:sectPr>

</xml_diff>